<commit_message>
Dust & Damnation: add the Monster Hunter calling (Frontier)
Co-Authored-By: Claude Opus 5.5 <noreply@anthropic.com>
Claude-Session: https://claude.ai/code/session_015SADCFzhKijkC2foUmXrpC
</commit_message>
<xml_diff>
--- a/legend-dynamics/western/Dust_Damnation_Players_Guide.docx
+++ b/legend-dynamics/western/Dust_Damnation_Players_Guide.docx
@@ -913,6 +913,69 @@
                 <w:sz w:val="19"/>
               </w:rPr>
               <w:t xml:space="preserve">Persuasion, Leadership, Occult, Shooting</w:t>
+            </w:r>
+          </w:p>
+        </w:tc>
+      </w:tr>
+      <w:tr>
+        <w:tc>
+          <w:tcPr/>
+          <w:p>
+            <w:pPr>
+              <w:pStyle w:val="Compact"/>
+              <w:jc w:val="left"/>
+            </w:pPr>
+            <w:r>
+              <w:rPr>
+                <w:b/>
+                <w:sz w:val="19"/>
+              </w:rPr>
+              <w:t xml:space="preserve">Monster Hunter</w:t>
+            </w:r>
+          </w:p>
+        </w:tc>
+        <w:tc>
+          <w:tcPr/>
+          <w:p>
+            <w:pPr>
+              <w:pStyle w:val="Compact"/>
+              <w:jc w:val="left"/>
+            </w:pPr>
+            <w:r>
+              <w:rPr>
+                <w:sz w:val="19"/>
+              </w:rPr>
+              <w:t xml:space="preserve">The Frontier</w:t>
+            </w:r>
+          </w:p>
+        </w:tc>
+        <w:tc>
+          <w:tcPr/>
+          <w:p>
+            <w:pPr>
+              <w:pStyle w:val="Compact"/>
+              <w:jc w:val="left"/>
+            </w:pPr>
+            <w:r>
+              <w:rPr>
+                <w:sz w:val="19"/>
+              </w:rPr>
+              <w:t xml:space="preserve">hunts what the law can’t hang, and knows which things fear silver, salt or fire (take the Monster Hunter advantage).</w:t>
+            </w:r>
+          </w:p>
+        </w:tc>
+        <w:tc>
+          <w:tcPr/>
+          <w:p>
+            <w:pPr>
+              <w:pStyle w:val="Compact"/>
+              <w:jc w:val="left"/>
+            </w:pPr>
+            <w:r>
+              <w:rPr>
+                <w:sz w:val="19"/>
+              </w:rPr>
+              <w:t xml:space="preserve">Occult, Tracking, Shooting, Melee</w:t>
             </w:r>
           </w:p>
         </w:tc>

</xml_diff>